<commit_message>
Auditor Files: DC.SLQ001 project plan refresh + add Design I/O Matrix
Made-with: Cursor
</commit_message>
<xml_diff>
--- a/Auditor Files/DC.SLQ001 (In Process)/DC.SLQ001 A Design Project Plan.docx
+++ b/Auditor Files/DC.SLQ001 (In Process)/DC.SLQ001 A Design Project Plan.docx
@@ -434,7 +434,15 @@
         <w:t>T</w:t>
       </w:r>
       <w:r>
-        <w:t>his is a retrospective design assessment. The valve geometry modification was implemented by the supplier (Ningbo Yingmed) prior to November 6, 2024. Devices incorporating the modified valve have been manufactured and distributed. Containment activities were completed under CAPA 001-2025. This project formalizes the design control documentation after the fact.</w:t>
+        <w:t xml:space="preserve">his is a retrospective design assessment. The valve geometry modification was implemented by the supplier (Ningbo </w:t>
+      </w:r>
+      <w:proofErr w:type="spellStart"/>
+      <w:r>
+        <w:t>Yingmed</w:t>
+      </w:r>
+      <w:proofErr w:type="spellEnd"/>
+      <w:r>
+        <w:t>) prior to November 6, 2024. Devices incorporating the modified valve have been manufactured and distributed. Containment activities were completed under CAPA 001-2025. This project formalizes the design control documentation after the fact.</w:t>
       </w:r>
     </w:p>
     <w:p>
@@ -564,7 +572,7 @@
         <w:tab/>
       </w:r>
       <w:r>
-        <w:t>Software Validation Plan, SilqQMS</w:t>
+        <w:t>Design Output SOP</w:t>
       </w:r>
     </w:p>
     <w:p>
@@ -587,7 +595,7 @@
         <w:tab/>
       </w:r>
       <w:r>
-        <w:t>Product Requirements Specification, SilqQMS</w:t>
+        <w:t>Design Review SOP</w:t>
       </w:r>
     </w:p>
     <w:p>
@@ -1087,7 +1095,21 @@
         <w:rPr>
           <w:bCs/>
         </w:rPr>
-        <w:t>A dimensional/geometry refinement to the check valve assembly implemented by the component supplier (Ningbo Yingmed) to improve seating consistency and reduce dislodgement probability. No material, functional, or performance changes were made.</w:t>
+        <w:t xml:space="preserve">A dimensional/geometry refinement to the check valve assembly implemented by the component supplier (Ningbo </w:t>
+      </w:r>
+      <w:proofErr w:type="spellStart"/>
+      <w:r>
+        <w:rPr>
+          <w:bCs/>
+        </w:rPr>
+        <w:t>Yingmed</w:t>
+      </w:r>
+      <w:proofErr w:type="spellEnd"/>
+      <w:r>
+        <w:rPr>
+          <w:bCs/>
+        </w:rPr>
+        <w:t>) to improve seating consistency and reduce dislodgement probability. No material, functional, or performance changes were made.</w:t>
       </w:r>
     </w:p>
     <w:p>
@@ -1185,7 +1207,15 @@
         <w:pStyle w:val="Heading2"/>
       </w:pPr>
       <w:r>
-        <w:t>The check valve assembly (Item No. 5 per device drawing) underwent a dimensional/geometry refinement by the component supplier (Ningbo Yingmed). The modification improves valve seating consistency and reduces dislodgement probability. No material or functional changes were made. The existing ≤26 mm dimensional acceptance criterion was specified prior to the modification and remains unchanged.</w:t>
+        <w:t xml:space="preserve">The check valve assembly (Item No. 5 per device drawing) underwent a dimensional/geometry refinement by the component supplier (Ningbo </w:t>
+      </w:r>
+      <w:proofErr w:type="spellStart"/>
+      <w:r>
+        <w:t>Yingmed</w:t>
+      </w:r>
+      <w:proofErr w:type="spellEnd"/>
+      <w:r>
+        <w:t>). The modification improves valve seating consistency and reduces dislodgement probability. No material or functional changes were made. The existing ≤26 mm dimensional acceptance criterion was specified prior to the modification and remains unchanged.</w:t>
       </w:r>
     </w:p>
     <w:p>
@@ -1373,8 +1403,13 @@
         <w:pStyle w:val="Heading2"/>
       </w:pPr>
       <w:r>
-        <w:t>Ningbo Yingmed</w:t>
-      </w:r>
+        <w:t xml:space="preserve">Ningbo </w:t>
+      </w:r>
+      <w:proofErr w:type="spellStart"/>
+      <w:r>
+        <w:t>Yingmed</w:t>
+      </w:r>
+      <w:proofErr w:type="spellEnd"/>
       <w:r>
         <w:t xml:space="preserve"> (</w:t>
       </w:r>
@@ -1487,7 +1522,16 @@
           <w:sz w:val="24"/>
           <w:szCs w:val="24"/>
         </w:rPr>
-        <w:t>Design Project Plan, Silq EDMS Transition</w:t>
+        <w:t xml:space="preserve">Design Project Plan, </w:t>
+      </w:r>
+      <w:r>
+        <w:rPr>
+          <w:rFonts w:ascii="Cambria" w:hAnsi="Cambria" w:cs="Arial"/>
+          <w:b/>
+          <w:sz w:val="24"/>
+          <w:szCs w:val="24"/>
+        </w:rPr>
+        <w:t>Design Assessment, Valve Component Modification, ClearTract Catheter</w:t>
       </w:r>
     </w:p>
     <w:tbl>

</xml_diff>